<commit_message>
docs: reescreve as notas das figuras do anexo de diagramas
As notas começavam citando a norma de notação de cada diagrama, o que
não ajudava quem lê: o título da figura já diz se é fluxograma, diagrama
de sequência ou modelo de dados.

Agora cada nota descreve o que aquela imagem mostra do sistema. A do
ciclo de missão, por exemplo, passou a apontar as três saídas possíveis
de uma tentativa. Esta é a versão enviada junto com o dossiê.
</commit_message>
<xml_diff>
--- a/docs/Ecoverse - Anexo de diagramas.docx
+++ b/docs/Ecoverse - Anexo de diagramas.docx
@@ -189,9 +189,9 @@
           <w:noProof/>
         </w:rPr>
         <w:drawing>
-          <wp:inline distT="0" distB="0" distL="0" distR="0" wp14:anchorId="4924EF92" wp14:editId="506D8121">
-            <wp:extent cx="9391650" cy="3676161"/>
-            <wp:effectExtent l="0" t="0" r="0" b="635"/>
+          <wp:inline distT="0" distB="0" distL="0" distR="0" wp14:anchorId="06A99B6C" wp14:editId="524C864E">
+            <wp:extent cx="9198230" cy="3600450"/>
+            <wp:effectExtent l="0" t="0" r="3175" b="0"/>
             <wp:docPr id="1" name="Imagem 1"/>
             <wp:cNvGraphicFramePr>
               <a:graphicFrameLocks xmlns:a="http://schemas.openxmlformats.org/drawingml/2006/main" noChangeAspect="1"/>
@@ -215,7 +215,7 @@
                   <pic:spPr bwMode="auto">
                     <a:xfrm>
                       <a:off x="0" y="0"/>
-                      <a:ext cx="9394029" cy="3677092"/>
+                      <a:ext cx="9208743" cy="3604565"/>
                     </a:xfrm>
                     <a:prstGeom prst="rect">
                       <a:avLst/>
@@ -354,10 +354,10 @@
           <w:noProof/>
         </w:rPr>
         <w:drawing>
-          <wp:inline distT="0" distB="0" distL="0" distR="0" wp14:anchorId="22703BB0" wp14:editId="5979468F">
-            <wp:extent cx="2497469" cy="7591425"/>
-            <wp:effectExtent l="0" t="0" r="0" b="0"/>
-            <wp:docPr id="1663842780" name="Imagem 1663842780"/>
+          <wp:inline distT="0" distB="0" distL="0" distR="0" wp14:anchorId="55E003E2" wp14:editId="69174F0B">
+            <wp:extent cx="2647950" cy="8048835"/>
+            <wp:effectExtent l="0" t="0" r="0" b="9525"/>
+            <wp:docPr id="788595210" name="Imagem 788595210"/>
             <wp:cNvGraphicFramePr>
               <a:graphicFrameLocks xmlns:a="http://schemas.openxmlformats.org/drawingml/2006/main" noChangeAspect="1"/>
             </wp:cNvGraphicFramePr>
@@ -380,7 +380,7 @@
                   <pic:spPr bwMode="auto">
                     <a:xfrm>
                       <a:off x="0" y="0"/>
-                      <a:ext cx="2501441" cy="7603499"/>
+                      <a:ext cx="2650805" cy="8057514"/>
                     </a:xfrm>
                     <a:prstGeom prst="rect">
                       <a:avLst/>
@@ -416,7 +416,7 @@
           <w:sz w:val="19"/>
           <w:szCs w:val="19"/>
         </w:rPr>
-        <w:t xml:space="preserve">Notação ISO 5807. Cobre </w:t>
+        <w:t xml:space="preserve">Cobre </w:t>
       </w:r>
       <w:proofErr w:type="gramStart"/>
       <w:r>
@@ -432,7 +432,7 @@
           <w:sz w:val="19"/>
           <w:szCs w:val="19"/>
         </w:rPr>
-        <w:t xml:space="preserve"> abertura da página até a aplicação ficar pronta para uso.</w:t>
+        <w:t xml:space="preserve"> abertura da página até a aplicação ficar pronta para uso, incluindo a leitura do progresso salvo e a sincronização quando existe conta.</w:t>
       </w:r>
     </w:p>
     <w:p>
@@ -469,10 +469,10 @@
           <w:noProof/>
         </w:rPr>
         <w:drawing>
-          <wp:inline distT="0" distB="0" distL="0" distR="0" wp14:anchorId="321E138A" wp14:editId="6AC17D30">
-            <wp:extent cx="5227637" cy="8105775"/>
+          <wp:inline distT="0" distB="0" distL="0" distR="0" wp14:anchorId="77C89592" wp14:editId="2B6AA594">
+            <wp:extent cx="5190780" cy="8048625"/>
             <wp:effectExtent l="0" t="0" r="0" b="0"/>
-            <wp:docPr id="469614660" name="Imagem 469614660"/>
+            <wp:docPr id="885452413" name="Imagem 885452413"/>
             <wp:cNvGraphicFramePr>
               <a:graphicFrameLocks xmlns:a="http://schemas.openxmlformats.org/drawingml/2006/main" noChangeAspect="1"/>
             </wp:cNvGraphicFramePr>
@@ -495,7 +495,7 @@
                   <pic:spPr bwMode="auto">
                     <a:xfrm>
                       <a:off x="0" y="0"/>
-                      <a:ext cx="5234868" cy="8116988"/>
+                      <a:ext cx="5199609" cy="8062316"/>
                     </a:xfrm>
                     <a:prstGeom prst="rect">
                       <a:avLst/>
@@ -531,7 +531,7 @@
           <w:sz w:val="19"/>
           <w:szCs w:val="19"/>
         </w:rPr>
-        <w:t>Notação ISO 5807. Laço principal do jogo, da seleção da missão até o registro do resultado.</w:t>
+        <w:t>Laço principal do jogo, da seleção da missão até o registro do resultado. Mostra as três saídas possíveis de uma tentativa: missão bloqueada, energia insuficiente e missão concluída.</w:t>
       </w:r>
     </w:p>
     <w:p>
@@ -568,10 +568,10 @@
           <w:noProof/>
         </w:rPr>
         <w:drawing>
-          <wp:inline distT="0" distB="0" distL="0" distR="0" wp14:anchorId="2A3F2171" wp14:editId="6515CF57">
-            <wp:extent cx="6264046" cy="7010400"/>
-            <wp:effectExtent l="0" t="0" r="3810" b="0"/>
-            <wp:docPr id="536498422" name="Imagem 536498422"/>
+          <wp:inline distT="0" distB="0" distL="0" distR="0" wp14:anchorId="719776FD" wp14:editId="562C8426">
+            <wp:extent cx="6238512" cy="6981825"/>
+            <wp:effectExtent l="0" t="0" r="0" b="0"/>
+            <wp:docPr id="702177390" name="Imagem 702177390"/>
             <wp:cNvGraphicFramePr>
               <a:graphicFrameLocks xmlns:a="http://schemas.openxmlformats.org/drawingml/2006/main" noChangeAspect="1"/>
             </wp:cNvGraphicFramePr>
@@ -594,7 +594,7 @@
                   <pic:spPr bwMode="auto">
                     <a:xfrm>
                       <a:off x="0" y="0"/>
-                      <a:ext cx="6270420" cy="7017534"/>
+                      <a:ext cx="6248523" cy="6993029"/>
                     </a:xfrm>
                     <a:prstGeom prst="rect">
                       <a:avLst/>
@@ -683,10 +683,10 @@
           <w:noProof/>
         </w:rPr>
         <w:drawing>
-          <wp:inline distT="0" distB="0" distL="0" distR="0" wp14:anchorId="45065FDD" wp14:editId="6F93F46D">
-            <wp:extent cx="7496175" cy="5318232"/>
-            <wp:effectExtent l="0" t="0" r="0" b="0"/>
-            <wp:docPr id="1369471860" name="Imagem 1369471860"/>
+          <wp:inline distT="0" distB="0" distL="0" distR="0" wp14:anchorId="16B1F9BB" wp14:editId="759D10B4">
+            <wp:extent cx="7504974" cy="5324475"/>
+            <wp:effectExtent l="0" t="0" r="1270" b="0"/>
+            <wp:docPr id="257961905" name="Imagem 257961905"/>
             <wp:cNvGraphicFramePr>
               <a:graphicFrameLocks xmlns:a="http://schemas.openxmlformats.org/drawingml/2006/main" noChangeAspect="1"/>
             </wp:cNvGraphicFramePr>
@@ -709,7 +709,7 @@
                   <pic:spPr bwMode="auto">
                     <a:xfrm>
                       <a:off x="0" y="0"/>
-                      <a:ext cx="7511786" cy="5329307"/>
+                      <a:ext cx="7517832" cy="5333597"/>
                     </a:xfrm>
                     <a:prstGeom prst="rect">
                       <a:avLst/>
@@ -745,7 +745,7 @@
           <w:sz w:val="19"/>
           <w:szCs w:val="19"/>
         </w:rPr>
-        <w:t>Notação UML 2.5. Do primeiro acesso até o progresso aparecer em um segundo aparelho.</w:t>
+        <w:t>Do primeiro acesso até o progresso aparecer em um segundo aparelho, passando pelo envio do link, pela criação automática do perfil e pela sincronização.</w:t>
       </w:r>
     </w:p>
     <w:p>
@@ -782,10 +782,10 @@
           <w:noProof/>
         </w:rPr>
         <w:drawing>
-          <wp:inline distT="0" distB="0" distL="0" distR="0" wp14:anchorId="161CBC43" wp14:editId="624FB462">
-            <wp:extent cx="2409825" cy="7880470"/>
-            <wp:effectExtent l="0" t="0" r="0" b="6350"/>
-            <wp:docPr id="1918526135" name="Imagem 1918526135"/>
+          <wp:inline distT="0" distB="0" distL="0" distR="0" wp14:anchorId="04A9C465" wp14:editId="3DE24558">
+            <wp:extent cx="2505075" cy="8191951"/>
+            <wp:effectExtent l="0" t="0" r="0" b="0"/>
+            <wp:docPr id="1890998777" name="Imagem 1890998777"/>
             <wp:cNvGraphicFramePr>
               <a:graphicFrameLocks xmlns:a="http://schemas.openxmlformats.org/drawingml/2006/main" noChangeAspect="1"/>
             </wp:cNvGraphicFramePr>
@@ -808,7 +808,7 @@
                   <pic:spPr bwMode="auto">
                     <a:xfrm>
                       <a:off x="0" y="0"/>
-                      <a:ext cx="2410663" cy="7883209"/>
+                      <a:ext cx="2507252" cy="8199069"/>
                     </a:xfrm>
                     <a:prstGeom prst="rect">
                       <a:avLst/>
@@ -844,7 +844,7 @@
           <w:sz w:val="19"/>
           <w:szCs w:val="19"/>
         </w:rPr>
-        <w:t>Notação ISO 5807. Regra de resolução quando o mesmo usuário avança em dois aparelhos.</w:t>
+        <w:t>Regra de resolução quando o mesmo usuário avança em dois aparelhos, campo a campo, sem depender de horário de relógio.</w:t>
       </w:r>
     </w:p>
     <w:sectPr>
@@ -860,10 +860,10 @@
 <file path=word/numbering.xml><?xml version="1.0" encoding="utf-8"?>
 <w:numbering xmlns:wpc="http://schemas.microsoft.com/office/word/2010/wordprocessingCanvas" xmlns:cx="http://schemas.microsoft.com/office/drawing/2014/chartex" xmlns:cx1="http://schemas.microsoft.com/office/drawing/2015/9/8/chartex" xmlns:cx2="http://schemas.microsoft.com/office/drawing/2015/10/21/chartex" xmlns:cx3="http://schemas.microsoft.com/office/drawing/2016/5/9/chartex" xmlns:cx4="http://schemas.microsoft.com/office/drawing/2016/5/10/chartex" xmlns:cx5="http://schemas.microsoft.com/office/drawing/2016/5/11/chartex" xmlns:cx6="http://schemas.microsoft.com/office/drawing/2016/5/12/chartex" xmlns:cx7="http://schemas.microsoft.com/office/drawing/2016/5/13/chartex" xmlns:cx8="http://schemas.microsoft.com/office/drawing/2016/5/14/chartex" xmlns:mc="http://schemas.openxmlformats.org/markup-compatibility/2006" xmlns:aink="http://schemas.microsoft.com/office/drawing/2016/ink" xmlns:am3d="http://schemas.microsoft.com/office/drawing/2017/model3d" xmlns:o="urn:schemas-microsoft-com:office:office" xmlns:oel="http://schemas.microsoft.com/office/2019/extlst" xmlns:r="http://schemas.openxmlformats.org/officeDocument/2006/relationships" xmlns:m="http://schemas.openxmlformats.org/officeDocument/2006/math" xmlns:v="urn:schemas-microsoft-com:vml" xmlns:wp14="http://schemas.microsoft.com/office/word/2010/wordprocessingDrawing" xmlns:wp="http://schemas.openxmlformats.org/drawingml/2006/wordprocessingDrawing" xmlns:w10="urn:schemas-microsoft-com:office:word" xmlns:w="http://schemas.openxmlformats.org/wordprocessingml/2006/main" xmlns:w14="http://schemas.microsoft.com/office/word/2010/wordml" xmlns:w15="http://schemas.microsoft.com/office/word/2012/wordml" xmlns:w16cex="http://schemas.microsoft.com/office/word/2018/wordml/cex" xmlns:w16cid="http://schemas.microsoft.com/office/word/2016/wordml/cid" xmlns:w16="http://schemas.microsoft.com/office/word/2018/wordml" xmlns:w16du="http://schemas.microsoft.com/office/word/2023/wordml/word16du" xmlns:w16sdtdh="http://schemas.microsoft.com/office/word/2020/wordml/sdtdatahash" xmlns:w16sdtfl="http://schemas.microsoft.com/office/word/2024/wordml/sdtformatlock" xmlns:w16se="http://schemas.microsoft.com/office/word/2015/wordml/symex" xmlns:wpg="http://schemas.microsoft.com/office/word/2010/wordprocessingGroup" xmlns:wpi="http://schemas.microsoft.com/office/word/2010/wordprocessingInk" xmlns:wne="http://schemas.microsoft.com/office/word/2006/wordml" xmlns:wps="http://schemas.microsoft.com/office/word/2010/wordprocessingShape" mc:Ignorable="w14 w15 w16se w16cid w16 w16cex w16sdtdh w16sdtfl w16du wp14">
   <w:abstractNum w:abstractNumId="0" w15:restartNumberingAfterBreak="0">
-    <w:nsid w:val="7A6C4F95"/>
+    <w:nsid w:val="5D9C78F8"/>
     <w:multiLevelType w:val="hybridMultilevel"/>
-    <w:tmpl w:val="C7CEC89C"/>
-    <w:lvl w:ilvl="0" w:tplc="7D06BB26">
+    <w:tmpl w:val="37B43FAE"/>
+    <w:lvl w:ilvl="0" w:tplc="7AEAF4CE">
       <w:start w:val="1"/>
       <w:numFmt w:val="bullet"/>
       <w:lvlText w:val="●"/>
@@ -872,7 +872,7 @@
         <w:ind w:left="720" w:hanging="360"/>
       </w:pPr>
     </w:lvl>
-    <w:lvl w:ilvl="1" w:tplc="30B05140">
+    <w:lvl w:ilvl="1" w:tplc="13F03F26">
       <w:start w:val="1"/>
       <w:numFmt w:val="bullet"/>
       <w:lvlText w:val="○"/>
@@ -881,7 +881,7 @@
         <w:ind w:left="1440" w:hanging="360"/>
       </w:pPr>
     </w:lvl>
-    <w:lvl w:ilvl="2" w:tplc="899452F6">
+    <w:lvl w:ilvl="2" w:tplc="0E7AD072">
       <w:start w:val="1"/>
       <w:numFmt w:val="bullet"/>
       <w:lvlText w:val="■"/>
@@ -890,7 +890,7 @@
         <w:ind w:left="2160" w:hanging="360"/>
       </w:pPr>
     </w:lvl>
-    <w:lvl w:ilvl="3" w:tplc="F81E17D8">
+    <w:lvl w:ilvl="3" w:tplc="3BB87B32">
       <w:start w:val="1"/>
       <w:numFmt w:val="bullet"/>
       <w:lvlText w:val="●"/>
@@ -899,7 +899,7 @@
         <w:ind w:left="2880" w:hanging="360"/>
       </w:pPr>
     </w:lvl>
-    <w:lvl w:ilvl="4" w:tplc="074AF822">
+    <w:lvl w:ilvl="4" w:tplc="B53EAD1A">
       <w:start w:val="1"/>
       <w:numFmt w:val="bullet"/>
       <w:lvlText w:val="○"/>
@@ -908,7 +908,7 @@
         <w:ind w:left="3600" w:hanging="360"/>
       </w:pPr>
     </w:lvl>
-    <w:lvl w:ilvl="5" w:tplc="C7B61A02">
+    <w:lvl w:ilvl="5" w:tplc="3D848366">
       <w:start w:val="1"/>
       <w:numFmt w:val="bullet"/>
       <w:lvlText w:val="■"/>
@@ -917,7 +917,7 @@
         <w:ind w:left="4320" w:hanging="360"/>
       </w:pPr>
     </w:lvl>
-    <w:lvl w:ilvl="6" w:tplc="481019B0">
+    <w:lvl w:ilvl="6" w:tplc="6BA2A2F0">
       <w:start w:val="1"/>
       <w:numFmt w:val="bullet"/>
       <w:lvlText w:val="●"/>
@@ -926,7 +926,7 @@
         <w:ind w:left="5040" w:hanging="360"/>
       </w:pPr>
     </w:lvl>
-    <w:lvl w:ilvl="7" w:tplc="C26056E4">
+    <w:lvl w:ilvl="7" w:tplc="56044322">
       <w:start w:val="1"/>
       <w:numFmt w:val="bullet"/>
       <w:lvlText w:val="●"/>
@@ -935,7 +935,7 @@
         <w:ind w:left="5760" w:hanging="360"/>
       </w:pPr>
     </w:lvl>
-    <w:lvl w:ilvl="8" w:tplc="D1B6E744">
+    <w:lvl w:ilvl="8" w:tplc="C644A16C">
       <w:start w:val="1"/>
       <w:numFmt w:val="bullet"/>
       <w:lvlText w:val="●"/>
@@ -945,7 +945,7 @@
       </w:pPr>
     </w:lvl>
   </w:abstractNum>
-  <w:num w:numId="1" w16cid:durableId="1968123182">
+  <w:num w:numId="1" w16cid:durableId="367485427">
     <w:abstractNumId w:val="0"/>
     <w:lvlOverride w:ilvl="0">
       <w:startOverride w:val="1"/>

</xml_diff>